<commit_message>
fix: add duplicate detection and UI display for bibliography entries
</commit_message>
<xml_diff>
--- a/tests/TestResult/Suite1-50.docx
+++ b/tests/TestResult/Suite1-50.docx
@@ -15,17 +15,15 @@
       </w:r>
     </w:p>
     <w:p>
-      <w:pPr>
+      <w:r>
         <w:rPr>
           <w:noProof/>
         </w:rPr>
-      </w:pPr>
-      <w:r>
         <w:drawing>
-          <wp:inline distT="0" distB="0" distL="0" distR="0" wp14:anchorId="5B985739" wp14:editId="1B44609D">
-            <wp:extent cx="5731510" cy="2668905"/>
+          <wp:inline distT="0" distB="0" distL="0" distR="0" wp14:anchorId="3BFCDBBF" wp14:editId="388250BB">
+            <wp:extent cx="5731510" cy="2726055"/>
             <wp:effectExtent l="0" t="0" r="2540" b="0"/>
-            <wp:docPr id="745260979" name="Picture 1"/>
+            <wp:docPr id="359294809" name="Picture 1"/>
             <wp:cNvGraphicFramePr>
               <a:graphicFrameLocks xmlns:a="http://schemas.openxmlformats.org/drawingml/2006/main" noChangeAspect="1"/>
             </wp:cNvGraphicFramePr>
@@ -33,7 +31,7 @@
               <a:graphicData uri="http://schemas.openxmlformats.org/drawingml/2006/picture">
                 <pic:pic xmlns:pic="http://schemas.openxmlformats.org/drawingml/2006/picture">
                   <pic:nvPicPr>
-                    <pic:cNvPr id="745260979" name=""/>
+                    <pic:cNvPr id="359294809" name=""/>
                     <pic:cNvPicPr/>
                   </pic:nvPicPr>
                   <pic:blipFill>
@@ -45,7 +43,7 @@
                   <pic:spPr>
                     <a:xfrm>
                       <a:off x="0" y="0"/>
-                      <a:ext cx="5731510" cy="2668905"/>
+                      <a:ext cx="5731510" cy="2726055"/>
                     </a:xfrm>
                     <a:prstGeom prst="rect">
                       <a:avLst/>
@@ -61,14 +59,11 @@
         <w:rPr>
           <w:noProof/>
         </w:rPr>
-        <w:t xml:space="preserve"> </w:t>
-      </w:r>
-      <w:r>
         <w:drawing>
-          <wp:inline distT="0" distB="0" distL="0" distR="0" wp14:anchorId="096E6F12" wp14:editId="6320248B">
-            <wp:extent cx="5731510" cy="1926590"/>
+          <wp:inline distT="0" distB="0" distL="0" distR="0" wp14:anchorId="203CD443" wp14:editId="04AF7931">
+            <wp:extent cx="5731510" cy="1721485"/>
             <wp:effectExtent l="0" t="0" r="2540" b="0"/>
-            <wp:docPr id="781424334" name="Picture 1"/>
+            <wp:docPr id="1970328222" name="Picture 1"/>
             <wp:cNvGraphicFramePr>
               <a:graphicFrameLocks xmlns:a="http://schemas.openxmlformats.org/drawingml/2006/main" noChangeAspect="1"/>
             </wp:cNvGraphicFramePr>
@@ -76,7 +71,7 @@
               <a:graphicData uri="http://schemas.openxmlformats.org/drawingml/2006/picture">
                 <pic:pic xmlns:pic="http://schemas.openxmlformats.org/drawingml/2006/picture">
                   <pic:nvPicPr>
-                    <pic:cNvPr id="781424334" name=""/>
+                    <pic:cNvPr id="1970328222" name=""/>
                     <pic:cNvPicPr/>
                   </pic:nvPicPr>
                   <pic:blipFill>
@@ -88,7 +83,47 @@
                   <pic:spPr>
                     <a:xfrm>
                       <a:off x="0" y="0"/>
-                      <a:ext cx="5731510" cy="1926590"/>
+                      <a:ext cx="5731510" cy="1721485"/>
+                    </a:xfrm>
+                    <a:prstGeom prst="rect">
+                      <a:avLst/>
+                    </a:prstGeom>
+                  </pic:spPr>
+                </pic:pic>
+              </a:graphicData>
+            </a:graphic>
+          </wp:inline>
+        </w:drawing>
+      </w:r>
+      <w:r>
+        <w:rPr>
+          <w:noProof/>
+        </w:rPr>
+        <w:drawing>
+          <wp:inline distT="0" distB="0" distL="0" distR="0" wp14:anchorId="7516E2A5" wp14:editId="6EB49FEA">
+            <wp:extent cx="5731510" cy="2707640"/>
+            <wp:effectExtent l="0" t="0" r="2540" b="0"/>
+            <wp:docPr id="1069629485" name="Picture 1"/>
+            <wp:cNvGraphicFramePr>
+              <a:graphicFrameLocks xmlns:a="http://schemas.openxmlformats.org/drawingml/2006/main" noChangeAspect="1"/>
+            </wp:cNvGraphicFramePr>
+            <a:graphic xmlns:a="http://schemas.openxmlformats.org/drawingml/2006/main">
+              <a:graphicData uri="http://schemas.openxmlformats.org/drawingml/2006/picture">
+                <pic:pic xmlns:pic="http://schemas.openxmlformats.org/drawingml/2006/picture">
+                  <pic:nvPicPr>
+                    <pic:cNvPr id="1069629485" name=""/>
+                    <pic:cNvPicPr/>
+                  </pic:nvPicPr>
+                  <pic:blipFill>
+                    <a:blip r:embed="rId6"/>
+                    <a:stretch>
+                      <a:fillRect/>
+                    </a:stretch>
+                  </pic:blipFill>
+                  <pic:spPr>
+                    <a:xfrm>
+                      <a:off x="0" y="0"/>
+                      <a:ext cx="5731510" cy="2707640"/>
                     </a:xfrm>
                     <a:prstGeom prst="rect">
                       <a:avLst/>
@@ -103,11 +138,15 @@
     </w:p>
     <w:p>
       <w:r>
+        <w:rPr>
+          <w:noProof/>
+        </w:rPr>
+        <w:lastRenderedPageBreak/>
         <w:drawing>
-          <wp:inline distT="0" distB="0" distL="0" distR="0" wp14:anchorId="3027FBE3" wp14:editId="748FB9FF">
-            <wp:extent cx="5731510" cy="2575560"/>
-            <wp:effectExtent l="0" t="0" r="2540" b="0"/>
-            <wp:docPr id="1685287596" name="Picture 1"/>
+          <wp:inline distT="0" distB="0" distL="0" distR="0" wp14:anchorId="713219CA" wp14:editId="01A74B29">
+            <wp:extent cx="5731510" cy="2357120"/>
+            <wp:effectExtent l="0" t="0" r="2540" b="5080"/>
+            <wp:docPr id="1198238800" name="Picture 1"/>
             <wp:cNvGraphicFramePr>
               <a:graphicFrameLocks xmlns:a="http://schemas.openxmlformats.org/drawingml/2006/main" noChangeAspect="1"/>
             </wp:cNvGraphicFramePr>
@@ -115,11 +154,11 @@
               <a:graphicData uri="http://schemas.openxmlformats.org/drawingml/2006/picture">
                 <pic:pic xmlns:pic="http://schemas.openxmlformats.org/drawingml/2006/picture">
                   <pic:nvPicPr>
-                    <pic:cNvPr id="1685287596" name=""/>
+                    <pic:cNvPr id="1198238800" name=""/>
                     <pic:cNvPicPr/>
                   </pic:nvPicPr>
                   <pic:blipFill>
-                    <a:blip r:embed="rId6"/>
+                    <a:blip r:embed="rId7"/>
                     <a:stretch>
                       <a:fillRect/>
                     </a:stretch>
@@ -127,7 +166,7 @@
                   <pic:spPr>
                     <a:xfrm>
                       <a:off x="0" y="0"/>
-                      <a:ext cx="5731510" cy="2575560"/>
+                      <a:ext cx="5731510" cy="2357120"/>
                     </a:xfrm>
                     <a:prstGeom prst="rect">
                       <a:avLst/>
@@ -142,12 +181,14 @@
     </w:p>
     <w:p>
       <w:r>
-        <w:lastRenderedPageBreak/>
+        <w:rPr>
+          <w:noProof/>
+        </w:rPr>
         <w:drawing>
-          <wp:inline distT="0" distB="0" distL="0" distR="0" wp14:anchorId="1B90AEDE" wp14:editId="53F67D69">
-            <wp:extent cx="5731510" cy="2637155"/>
+          <wp:inline distT="0" distB="0" distL="0" distR="0" wp14:anchorId="3F7913A9" wp14:editId="1088DEC4">
+            <wp:extent cx="5731510" cy="2483485"/>
             <wp:effectExtent l="0" t="0" r="2540" b="0"/>
-            <wp:docPr id="463337485" name="Picture 1"/>
+            <wp:docPr id="1365962299" name="Picture 1"/>
             <wp:cNvGraphicFramePr>
               <a:graphicFrameLocks xmlns:a="http://schemas.openxmlformats.org/drawingml/2006/main" noChangeAspect="1"/>
             </wp:cNvGraphicFramePr>
@@ -155,11 +196,11 @@
               <a:graphicData uri="http://schemas.openxmlformats.org/drawingml/2006/picture">
                 <pic:pic xmlns:pic="http://schemas.openxmlformats.org/drawingml/2006/picture">
                   <pic:nvPicPr>
-                    <pic:cNvPr id="463337485" name=""/>
+                    <pic:cNvPr id="1365962299" name=""/>
                     <pic:cNvPicPr/>
                   </pic:nvPicPr>
                   <pic:blipFill>
-                    <a:blip r:embed="rId7"/>
+                    <a:blip r:embed="rId8"/>
                     <a:stretch>
                       <a:fillRect/>
                     </a:stretch>
@@ -167,7 +208,7 @@
                   <pic:spPr>
                     <a:xfrm>
                       <a:off x="0" y="0"/>
-                      <a:ext cx="5731510" cy="2637155"/>
+                      <a:ext cx="5731510" cy="2483485"/>
                     </a:xfrm>
                     <a:prstGeom prst="rect">
                       <a:avLst/>
@@ -180,6 +221,219 @@
         </w:drawing>
       </w:r>
     </w:p>
+    <w:p>
+      <w:pPr>
+        <w:rPr>
+          <w:b/>
+          <w:bCs/>
+        </w:rPr>
+      </w:pPr>
+      <w:r>
+        <w:rPr>
+          <w:b/>
+          <w:bCs/>
+        </w:rPr>
+        <w:t>LNI_Test_Suite_02.pdf</w:t>
+      </w:r>
+    </w:p>
+    <w:p>
+      <w:pPr>
+        <w:rPr>
+          <w:b/>
+          <w:bCs/>
+        </w:rPr>
+      </w:pPr>
+      <w:r>
+        <w:rPr>
+          <w:b/>
+          <w:bCs/>
+        </w:rPr>
+        <w:drawing>
+          <wp:inline distT="0" distB="0" distL="0" distR="0" wp14:anchorId="3B4E2E34" wp14:editId="778737EC">
+            <wp:extent cx="5731510" cy="2618740"/>
+            <wp:effectExtent l="0" t="0" r="2540" b="0"/>
+            <wp:docPr id="795606284" name="Picture 1"/>
+            <wp:cNvGraphicFramePr>
+              <a:graphicFrameLocks xmlns:a="http://schemas.openxmlformats.org/drawingml/2006/main" noChangeAspect="1"/>
+            </wp:cNvGraphicFramePr>
+            <a:graphic xmlns:a="http://schemas.openxmlformats.org/drawingml/2006/main">
+              <a:graphicData uri="http://schemas.openxmlformats.org/drawingml/2006/picture">
+                <pic:pic xmlns:pic="http://schemas.openxmlformats.org/drawingml/2006/picture">
+                  <pic:nvPicPr>
+                    <pic:cNvPr id="795606284" name=""/>
+                    <pic:cNvPicPr/>
+                  </pic:nvPicPr>
+                  <pic:blipFill>
+                    <a:blip r:embed="rId9"/>
+                    <a:stretch>
+                      <a:fillRect/>
+                    </a:stretch>
+                  </pic:blipFill>
+                  <pic:spPr>
+                    <a:xfrm>
+                      <a:off x="0" y="0"/>
+                      <a:ext cx="5731510" cy="2618740"/>
+                    </a:xfrm>
+                    <a:prstGeom prst="rect">
+                      <a:avLst/>
+                    </a:prstGeom>
+                  </pic:spPr>
+                </pic:pic>
+              </a:graphicData>
+            </a:graphic>
+          </wp:inline>
+        </w:drawing>
+      </w:r>
+    </w:p>
+    <w:p>
+      <w:pPr>
+        <w:rPr>
+          <w:b/>
+          <w:bCs/>
+        </w:rPr>
+      </w:pPr>
+      <w:r>
+        <w:rPr>
+          <w:b/>
+          <w:bCs/>
+        </w:rPr>
+        <w:lastRenderedPageBreak/>
+        <w:drawing>
+          <wp:inline distT="0" distB="0" distL="0" distR="0" wp14:anchorId="24A196F1" wp14:editId="1031DD80">
+            <wp:extent cx="5731510" cy="2900680"/>
+            <wp:effectExtent l="0" t="0" r="2540" b="0"/>
+            <wp:docPr id="1541049281" name="Picture 1"/>
+            <wp:cNvGraphicFramePr>
+              <a:graphicFrameLocks xmlns:a="http://schemas.openxmlformats.org/drawingml/2006/main" noChangeAspect="1"/>
+            </wp:cNvGraphicFramePr>
+            <a:graphic xmlns:a="http://schemas.openxmlformats.org/drawingml/2006/main">
+              <a:graphicData uri="http://schemas.openxmlformats.org/drawingml/2006/picture">
+                <pic:pic xmlns:pic="http://schemas.openxmlformats.org/drawingml/2006/picture">
+                  <pic:nvPicPr>
+                    <pic:cNvPr id="1541049281" name=""/>
+                    <pic:cNvPicPr/>
+                  </pic:nvPicPr>
+                  <pic:blipFill>
+                    <a:blip r:embed="rId10"/>
+                    <a:stretch>
+                      <a:fillRect/>
+                    </a:stretch>
+                  </pic:blipFill>
+                  <pic:spPr>
+                    <a:xfrm>
+                      <a:off x="0" y="0"/>
+                      <a:ext cx="5731510" cy="2900680"/>
+                    </a:xfrm>
+                    <a:prstGeom prst="rect">
+                      <a:avLst/>
+                    </a:prstGeom>
+                  </pic:spPr>
+                </pic:pic>
+              </a:graphicData>
+            </a:graphic>
+          </wp:inline>
+        </w:drawing>
+      </w:r>
+      <w:r>
+        <w:rPr>
+          <w:b/>
+          <w:bCs/>
+        </w:rPr>
+        <w:drawing>
+          <wp:inline distT="0" distB="0" distL="0" distR="0" wp14:anchorId="4CFCCDBB" wp14:editId="48FBA2B5">
+            <wp:extent cx="5731510" cy="1844040"/>
+            <wp:effectExtent l="0" t="0" r="2540" b="3810"/>
+            <wp:docPr id="544765559" name="Picture 1"/>
+            <wp:cNvGraphicFramePr>
+              <a:graphicFrameLocks xmlns:a="http://schemas.openxmlformats.org/drawingml/2006/main" noChangeAspect="1"/>
+            </wp:cNvGraphicFramePr>
+            <a:graphic xmlns:a="http://schemas.openxmlformats.org/drawingml/2006/main">
+              <a:graphicData uri="http://schemas.openxmlformats.org/drawingml/2006/picture">
+                <pic:pic xmlns:pic="http://schemas.openxmlformats.org/drawingml/2006/picture">
+                  <pic:nvPicPr>
+                    <pic:cNvPr id="544765559" name=""/>
+                    <pic:cNvPicPr/>
+                  </pic:nvPicPr>
+                  <pic:blipFill>
+                    <a:blip r:embed="rId11"/>
+                    <a:stretch>
+                      <a:fillRect/>
+                    </a:stretch>
+                  </pic:blipFill>
+                  <pic:spPr>
+                    <a:xfrm>
+                      <a:off x="0" y="0"/>
+                      <a:ext cx="5731510" cy="1844040"/>
+                    </a:xfrm>
+                    <a:prstGeom prst="rect">
+                      <a:avLst/>
+                    </a:prstGeom>
+                  </pic:spPr>
+                </pic:pic>
+              </a:graphicData>
+            </a:graphic>
+          </wp:inline>
+        </w:drawing>
+      </w:r>
+      <w:r>
+        <w:rPr>
+          <w:b/>
+          <w:bCs/>
+        </w:rPr>
+        <w:drawing>
+          <wp:inline distT="0" distB="0" distL="0" distR="0" wp14:anchorId="1AB8E60F" wp14:editId="48F32105">
+            <wp:extent cx="5731510" cy="2924810"/>
+            <wp:effectExtent l="0" t="0" r="2540" b="8890"/>
+            <wp:docPr id="2132119543" name="Picture 1"/>
+            <wp:cNvGraphicFramePr>
+              <a:graphicFrameLocks xmlns:a="http://schemas.openxmlformats.org/drawingml/2006/main" noChangeAspect="1"/>
+            </wp:cNvGraphicFramePr>
+            <a:graphic xmlns:a="http://schemas.openxmlformats.org/drawingml/2006/main">
+              <a:graphicData uri="http://schemas.openxmlformats.org/drawingml/2006/picture">
+                <pic:pic xmlns:pic="http://schemas.openxmlformats.org/drawingml/2006/picture">
+                  <pic:nvPicPr>
+                    <pic:cNvPr id="2132119543" name=""/>
+                    <pic:cNvPicPr/>
+                  </pic:nvPicPr>
+                  <pic:blipFill>
+                    <a:blip r:embed="rId12"/>
+                    <a:stretch>
+                      <a:fillRect/>
+                    </a:stretch>
+                  </pic:blipFill>
+                  <pic:spPr>
+                    <a:xfrm>
+                      <a:off x="0" y="0"/>
+                      <a:ext cx="5731510" cy="2924810"/>
+                    </a:xfrm>
+                    <a:prstGeom prst="rect">
+                      <a:avLst/>
+                    </a:prstGeom>
+                  </pic:spPr>
+                </pic:pic>
+              </a:graphicData>
+            </a:graphic>
+          </wp:inline>
+        </w:drawing>
+      </w:r>
+    </w:p>
+    <w:p/>
+    <w:p/>
+    <w:p>
+      <w:pPr>
+        <w:rPr>
+          <w:noProof/>
+        </w:rPr>
+      </w:pPr>
+      <w:r>
+        <w:rPr>
+          <w:noProof/>
+        </w:rPr>
+        <w:t xml:space="preserve"> </w:t>
+      </w:r>
+    </w:p>
+    <w:p/>
+    <w:p/>
     <w:p/>
     <w:sectPr>
       <w:pgSz w:w="11906" w:h="16838"/>
@@ -794,6 +1048,7 @@
   <w:style w:type="character" w:default="1" w:styleId="DefaultParagraphFont">
     <w:name w:val="Default Paragraph Font"/>
     <w:uiPriority w:val="1"/>
+    <w:semiHidden/>
     <w:unhideWhenUsed/>
   </w:style>
   <w:style w:type="table" w:default="1" w:styleId="TableNormal">

</xml_diff>